<commit_message>
Making edits to the manuscript
</commit_message>
<xml_diff>
--- a/Docs/Manuscript/Manuscript_Outline_draft5.docx
+++ b/Docs/Manuscript/Manuscript_Outline_draft5.docx
@@ -74,6 +74,589 @@
         </w:rPr>
         <w:t>Introduction</w:t>
       </w:r>
+    </w:p>
+    <w:p>
+      <w:pPr>
+        <w:pStyle w:val="NormalWeb"/>
+        <w:spacing w:before="0" w:beforeAutospacing="0" w:after="0" w:afterAutospacing="0"/>
+      </w:pPr>
+      <w:r>
+        <w:t>Sexual differentiation</w:t>
+      </w:r>
+    </w:p>
+    <w:p>
+      <w:pPr>
+        <w:pStyle w:val="NormalWeb"/>
+        <w:numPr>
+          <w:ilvl w:val="0"/>
+          <w:numId w:val="14"/>
+        </w:numPr>
+        <w:spacing w:before="0" w:beforeAutospacing="0" w:after="0" w:afterAutospacing="0"/>
+      </w:pPr>
+      <w:r>
+        <w:t xml:space="preserve">Sexual differentiation among sexes has </w:t>
+      </w:r>
+      <w:r>
+        <w:t xml:space="preserve">been a topic of </w:t>
+      </w:r>
+      <w:r>
+        <w:t xml:space="preserve">interest to </w:t>
+      </w:r>
+      <w:r>
+        <w:t>evolutionary biologists</w:t>
+      </w:r>
+      <w:r>
+        <w:t xml:space="preserve"> since Darwin’s time</w:t>
+      </w:r>
+      <w:r>
+        <w:t xml:space="preserve">. </w:t>
+      </w:r>
+      <w:r>
+        <w:t>Resources allocated to</w:t>
+      </w:r>
+      <w:r>
+        <w:t xml:space="preserve"> reproduction</w:t>
+      </w:r>
+      <w:r>
+        <w:t xml:space="preserve"> </w:t>
+      </w:r>
+      <w:r>
+        <w:t xml:space="preserve">can differ remarkable between sexes. Prior to fertilization, competition for mates </w:t>
+      </w:r>
+      <w:r>
+        <w:t xml:space="preserve">through behaviors </w:t>
+      </w:r>
+      <w:r>
+        <w:t xml:space="preserve">such as </w:t>
+      </w:r>
+      <w:r>
+        <w:t xml:space="preserve">elaborate </w:t>
+      </w:r>
+      <w:r>
+        <w:t xml:space="preserve">mating dances, outrageous morphological characteristics, </w:t>
+      </w:r>
+      <w:r>
+        <w:t>or through attracting pollinators or easily dispersing/</w:t>
+      </w:r>
+      <w:r>
+        <w:t>collecting pollen. Post fertilization</w:t>
+      </w:r>
+      <w:r>
+        <w:t xml:space="preserve"> sexual differentiation in resource allocation can be even more costly in the form of</w:t>
+      </w:r>
+      <w:r>
+        <w:t xml:space="preserve"> </w:t>
+      </w:r>
+      <w:r>
+        <w:t xml:space="preserve">carrying </w:t>
+      </w:r>
+      <w:r>
+        <w:t>and g</w:t>
+      </w:r>
+      <w:r>
+        <w:t>r</w:t>
+      </w:r>
+      <w:r>
+        <w:t xml:space="preserve">owing the </w:t>
+      </w:r>
+      <w:r>
+        <w:t xml:space="preserve">developing young, </w:t>
+      </w:r>
+      <w:r>
+        <w:t>devoting time</w:t>
+      </w:r>
+      <w:r>
+        <w:t xml:space="preserve"> to parental care</w:t>
+      </w:r>
+      <w:r>
+        <w:t xml:space="preserve">, or </w:t>
+      </w:r>
+      <w:r>
+        <w:t>provisioning young with resources</w:t>
+      </w:r>
+      <w:r>
+        <w:t>.</w:t>
+      </w:r>
+      <w:r>
+        <w:t xml:space="preserve"> Differential selection between the sexes ensures efficient </w:t>
+      </w:r>
+      <w:r>
+        <w:t xml:space="preserve">modes of selection that promote the fittest of a generation. </w:t>
+      </w:r>
+      <w:r>
+        <w:t xml:space="preserve">However, </w:t>
+      </w:r>
+      <w:r>
+        <w:t xml:space="preserve">sexual conflict can also arise </w:t>
+      </w:r>
+      <w:r>
+        <w:t>when traits that improve female fitness are detrimental to male fitness</w:t>
+      </w:r>
+      <w:r>
+        <w:t xml:space="preserve">, buffering the </w:t>
+      </w:r>
+      <w:r>
+        <w:t xml:space="preserve">potential for divergence between sexes. </w:t>
+      </w:r>
+    </w:p>
+    <w:p>
+      <w:pPr>
+        <w:pStyle w:val="NormalWeb"/>
+        <w:numPr>
+          <w:ilvl w:val="0"/>
+          <w:numId w:val="14"/>
+        </w:numPr>
+        <w:spacing w:before="0" w:beforeAutospacing="0" w:after="0" w:afterAutospacing="0"/>
+      </w:pPr>
+      <w:r>
+        <w:t>For example, in hermaphrodite flowers, the female and male components are often separat</w:t>
+      </w:r>
+      <w:r>
+        <w:t xml:space="preserve">ed temporally through protandry. </w:t>
+      </w:r>
+      <w:r>
+        <w:t xml:space="preserve">Sexual conflict can arise through the amount of time that the female vs male components are </w:t>
+      </w:r>
+      <w:r>
+        <w:t xml:space="preserve">exposed for pollination. </w:t>
+      </w:r>
+      <w:r>
+        <w:t xml:space="preserve"> </w:t>
+      </w:r>
+    </w:p>
+    <w:p>
+      <w:pPr>
+        <w:pStyle w:val="NormalWeb"/>
+        <w:numPr>
+          <w:ilvl w:val="0"/>
+          <w:numId w:val="14"/>
+        </w:numPr>
+        <w:spacing w:before="0" w:beforeAutospacing="0" w:after="0" w:afterAutospacing="0"/>
+      </w:pPr>
+      <w:r>
+        <w:t>Though these div</w:t>
+      </w:r>
+      <w:r>
+        <w:t xml:space="preserve">ergences between the sexes may be in conflict, where traits that improve female fitness </w:t>
+      </w:r>
+      <w:r>
+        <w:t xml:space="preserve">do not improve male fitness. </w:t>
+      </w:r>
+      <w:r>
+        <w:t>Thus, s</w:t>
+      </w:r>
+      <w:r>
+        <w:t xml:space="preserve">exual conflict </w:t>
+      </w:r>
+      <w:r>
+        <w:t>buffers</w:t>
+      </w:r>
+      <w:r>
+        <w:t xml:space="preserve"> the extent of sexual differentiation. </w:t>
+      </w:r>
+    </w:p>
+    <w:p>
+      <w:pPr>
+        <w:pStyle w:val="NormalWeb"/>
+        <w:numPr>
+          <w:ilvl w:val="1"/>
+          <w:numId w:val="14"/>
+        </w:numPr>
+        <w:spacing w:before="0" w:beforeAutospacing="0" w:after="0" w:afterAutospacing="0"/>
+      </w:pPr>
+      <w:r>
+        <w:t xml:space="preserve">Stephen </w:t>
+      </w:r>
+      <w:proofErr w:type="spellStart"/>
+      <w:r>
+        <w:t>Barrot</w:t>
+      </w:r>
+      <w:proofErr w:type="spellEnd"/>
+      <w:r>
+        <w:t xml:space="preserve"> paper</w:t>
+      </w:r>
+    </w:p>
+    <w:p>
+      <w:pPr>
+        <w:pStyle w:val="NormalWeb"/>
+        <w:numPr>
+          <w:ilvl w:val="0"/>
+          <w:numId w:val="14"/>
+        </w:numPr>
+        <w:spacing w:before="0" w:beforeAutospacing="0" w:after="0" w:afterAutospacing="0"/>
+      </w:pPr>
+      <w:r>
+        <w:t xml:space="preserve">Environmental conditions may impact </w:t>
+      </w:r>
+      <w:r>
+        <w:t xml:space="preserve">the fitness of females and hermaphrodites differently, whether in the form of </w:t>
+      </w:r>
+      <w:r>
+        <w:t>survival, growth, or reproductive output</w:t>
+      </w:r>
+      <w:r>
+        <w:t>. Such demographic responses can impact the relative numbers of females and males</w:t>
+      </w:r>
+      <w:r>
+        <w:t xml:space="preserve"> or sex ratio. </w:t>
+      </w:r>
+    </w:p>
+    <w:p>
+      <w:pPr>
+        <w:pStyle w:val="NormalWeb"/>
+        <w:spacing w:before="0" w:beforeAutospacing="0" w:after="0" w:afterAutospacing="0"/>
+      </w:pPr>
+      <w:r>
+        <w:t>Sex ratio</w:t>
+      </w:r>
+    </w:p>
+    <w:p>
+      <w:pPr>
+        <w:pStyle w:val="NormalWeb"/>
+        <w:numPr>
+          <w:ilvl w:val="0"/>
+          <w:numId w:val="15"/>
+        </w:numPr>
+        <w:spacing w:before="0" w:beforeAutospacing="0" w:after="0" w:afterAutospacing="0"/>
+      </w:pPr>
+      <w:r>
+        <w:t>The sex ratio of a population depends on the primary sex ratio</w:t>
+      </w:r>
+      <w:r>
+        <w:t xml:space="preserve"> (proportion of each sex produced at birth) and sex-specific </w:t>
+      </w:r>
+      <w:r>
+        <w:t>vital</w:t>
+      </w:r>
+      <w:r>
+        <w:t xml:space="preserve"> rates. </w:t>
+      </w:r>
+      <w:r>
+        <w:t xml:space="preserve">The sex ratio is constrained by negative frequency dependence. </w:t>
+      </w:r>
+      <w:r>
+        <w:t>As the relative number of one sex increases, the number of potential mates decreases</w:t>
+      </w:r>
+      <w:r>
+        <w:t xml:space="preserve"> reducing the fitness of </w:t>
+      </w:r>
+      <w:r>
+        <w:t xml:space="preserve">individuals of the dominant sex. The fitness of the rare sex </w:t>
+      </w:r>
+    </w:p>
+    <w:p>
+      <w:pPr>
+        <w:pStyle w:val="NormalWeb"/>
+        <w:numPr>
+          <w:ilvl w:val="0"/>
+          <w:numId w:val="15"/>
+        </w:numPr>
+        <w:spacing w:before="0" w:beforeAutospacing="0" w:after="0" w:afterAutospacing="0"/>
+      </w:pPr>
+      <w:r>
+        <w:t>Frequency dependence</w:t>
+      </w:r>
+    </w:p>
+    <w:p>
+      <w:pPr>
+        <w:pStyle w:val="NormalWeb"/>
+        <w:spacing w:before="0" w:beforeAutospacing="0" w:after="0" w:afterAutospacing="0"/>
+      </w:pPr>
+      <w:proofErr w:type="spellStart"/>
+      <w:r>
+        <w:t>Gynodioecy</w:t>
+      </w:r>
+      <w:proofErr w:type="spellEnd"/>
+    </w:p>
+    <w:p>
+      <w:pPr>
+        <w:pStyle w:val="NormalWeb"/>
+        <w:numPr>
+          <w:ilvl w:val="0"/>
+          <w:numId w:val="15"/>
+        </w:numPr>
+        <w:spacing w:before="0" w:beforeAutospacing="0" w:after="0" w:afterAutospacing="0"/>
+      </w:pPr>
+      <w:proofErr w:type="spellStart"/>
+      <w:r>
+        <w:t>Gynodioecy</w:t>
+      </w:r>
+      <w:proofErr w:type="spellEnd"/>
+      <w:r>
+        <w:t xml:space="preserve"> is a mating system characterized b</w:t>
+      </w:r>
+      <w:r>
+        <w:t xml:space="preserve">y the maintenance of both hermaphrodite and female individuals. </w:t>
+      </w:r>
+    </w:p>
+    <w:p>
+      <w:pPr>
+        <w:pStyle w:val="NormalWeb"/>
+        <w:spacing w:before="0" w:beforeAutospacing="0" w:after="0" w:afterAutospacing="0"/>
+      </w:pPr>
+    </w:p>
+    <w:p>
+      <w:pPr>
+        <w:pStyle w:val="NormalWeb"/>
+        <w:spacing w:before="0" w:beforeAutospacing="0" w:after="0" w:afterAutospacing="0"/>
+      </w:pPr>
+    </w:p>
+    <w:p>
+      <w:pPr>
+        <w:pStyle w:val="NormalWeb"/>
+        <w:numPr>
+          <w:ilvl w:val="0"/>
+          <w:numId w:val="16"/>
+        </w:numPr>
+        <w:spacing w:before="0" w:beforeAutospacing="0" w:after="240" w:afterAutospacing="0"/>
+      </w:pPr>
+      <w:r>
+        <w:t xml:space="preserve">Is there </w:t>
+      </w:r>
+      <w:r>
+        <w:t xml:space="preserve">differential </w:t>
+      </w:r>
+      <w:r>
+        <w:t>selection</w:t>
+      </w:r>
+      <w:r>
+        <w:t xml:space="preserve"> for floral traits</w:t>
+      </w:r>
+      <w:r>
+        <w:t xml:space="preserve"> in females and hermaphrodites</w:t>
+      </w:r>
+      <w:r>
+        <w:t>?</w:t>
+      </w:r>
+    </w:p>
+    <w:p>
+      <w:pPr>
+        <w:pStyle w:val="NormalWeb"/>
+        <w:numPr>
+          <w:ilvl w:val="0"/>
+          <w:numId w:val="16"/>
+        </w:numPr>
+        <w:spacing w:before="0" w:beforeAutospacing="0" w:after="240" w:afterAutospacing="0"/>
+      </w:pPr>
+      <w:r>
+        <w:t>Do the site-level and micro-level sex ratios impact pollination and ultimately reproductive output?</w:t>
+      </w:r>
+    </w:p>
+    <w:p>
+      <w:pPr>
+        <w:pStyle w:val="NormalWeb"/>
+        <w:numPr>
+          <w:ilvl w:val="0"/>
+          <w:numId w:val="16"/>
+        </w:numPr>
+        <w:spacing w:before="0" w:beforeAutospacing="0" w:after="240" w:afterAutospacing="0"/>
+      </w:pPr>
+      <w:r>
+        <w:t>What are the implications of patterns of selection for the evolutionary trajectory of this species?</w:t>
+      </w:r>
+    </w:p>
+    <w:p>
+      <w:pPr>
+        <w:pStyle w:val="NormalWeb"/>
+        <w:spacing w:before="0" w:beforeAutospacing="0" w:after="0" w:afterAutospacing="0"/>
+      </w:pPr>
+    </w:p>
+    <w:p>
+      <w:pPr>
+        <w:pStyle w:val="NormalWeb"/>
+        <w:spacing w:before="0" w:beforeAutospacing="0" w:after="0" w:afterAutospacing="0"/>
+      </w:pPr>
+    </w:p>
+    <w:p>
+      <w:pPr>
+        <w:pStyle w:val="NormalWeb"/>
+        <w:spacing w:before="0" w:beforeAutospacing="0" w:after="0" w:afterAutospacing="0"/>
+      </w:pPr>
+      <w:proofErr w:type="spellStart"/>
+      <w:r>
+        <w:t>Gynodioecy</w:t>
+      </w:r>
+      <w:proofErr w:type="spellEnd"/>
+    </w:p>
+    <w:p>
+      <w:pPr>
+        <w:pStyle w:val="NormalWeb"/>
+        <w:numPr>
+          <w:ilvl w:val="0"/>
+          <w:numId w:val="14"/>
+        </w:numPr>
+        <w:spacing w:before="0" w:beforeAutospacing="0" w:after="0" w:afterAutospacing="0"/>
+      </w:pPr>
+      <w:proofErr w:type="spellStart"/>
+      <w:r>
+        <w:t>Gynodioecy</w:t>
+      </w:r>
+      <w:proofErr w:type="spellEnd"/>
+      <w:r>
+        <w:t xml:space="preserve">, characterized by females and hermaphrodites, </w:t>
+      </w:r>
+    </w:p>
+    <w:p>
+      <w:pPr>
+        <w:pStyle w:val="NormalWeb"/>
+        <w:spacing w:before="0" w:beforeAutospacing="0" w:after="0" w:afterAutospacing="0"/>
+        <w:ind w:firstLine="360"/>
+      </w:pPr>
+      <w:r>
+        <w:t xml:space="preserve">First sentence and last sentence- and the supporting </w:t>
+      </w:r>
+      <w:r>
+        <w:t>evidence</w:t>
+      </w:r>
+    </w:p>
+    <w:p>
+      <w:pPr>
+        <w:pStyle w:val="NormalWeb"/>
+        <w:spacing w:before="0" w:beforeAutospacing="0" w:after="0" w:afterAutospacing="0"/>
+        <w:ind w:firstLine="360"/>
+      </w:pPr>
+      <w:r>
+        <w:t>Don’t worry about citing</w:t>
+      </w:r>
+    </w:p>
+    <w:p>
+      <w:pPr>
+        <w:pStyle w:val="NormalWeb"/>
+        <w:spacing w:before="0" w:beforeAutospacing="0" w:after="0" w:afterAutospacing="0"/>
+        <w:ind w:firstLine="360"/>
+      </w:pPr>
+      <w:r>
+        <w:t xml:space="preserve">What are the three things I need to talk </w:t>
+      </w:r>
+      <w:proofErr w:type="gramStart"/>
+      <w:r>
+        <w:t>about</w:t>
+      </w:r>
+      <w:proofErr w:type="gramEnd"/>
+      <w:r>
+        <w:t xml:space="preserve"> </w:t>
+      </w:r>
+    </w:p>
+    <w:p>
+      <w:pPr>
+        <w:pStyle w:val="NormalWeb"/>
+        <w:numPr>
+          <w:ilvl w:val="0"/>
+          <w:numId w:val="12"/>
+        </w:numPr>
+        <w:spacing w:before="0" w:beforeAutospacing="0" w:after="0" w:afterAutospacing="0"/>
+      </w:pPr>
+      <w:r>
+        <w:t>Female and male fitness</w:t>
+      </w:r>
+    </w:p>
+    <w:p>
+      <w:pPr>
+        <w:pStyle w:val="NormalWeb"/>
+        <w:numPr>
+          <w:ilvl w:val="0"/>
+          <w:numId w:val="12"/>
+        </w:numPr>
+        <w:spacing w:before="0" w:beforeAutospacing="0" w:after="0" w:afterAutospacing="0"/>
+      </w:pPr>
+      <w:r>
+        <w:t>Frequency dependent selection</w:t>
+      </w:r>
+    </w:p>
+    <w:p>
+      <w:pPr>
+        <w:pStyle w:val="NormalWeb"/>
+        <w:numPr>
+          <w:ilvl w:val="0"/>
+          <w:numId w:val="12"/>
+        </w:numPr>
+        <w:spacing w:before="0" w:beforeAutospacing="0" w:after="0" w:afterAutospacing="0"/>
+      </w:pPr>
+      <w:r>
+        <w:t>Sex ratios</w:t>
+      </w:r>
+    </w:p>
+    <w:p>
+      <w:pPr>
+        <w:pStyle w:val="NormalWeb"/>
+        <w:numPr>
+          <w:ilvl w:val="0"/>
+          <w:numId w:val="12"/>
+        </w:numPr>
+        <w:spacing w:before="0" w:beforeAutospacing="0" w:after="0" w:afterAutospacing="0"/>
+      </w:pPr>
+      <w:proofErr w:type="spellStart"/>
+      <w:r>
+        <w:t>Gynodioecy</w:t>
+      </w:r>
+      <w:proofErr w:type="spellEnd"/>
+    </w:p>
+    <w:p>
+      <w:pPr>
+        <w:pStyle w:val="NormalWeb"/>
+        <w:spacing w:before="0" w:beforeAutospacing="0" w:after="0" w:afterAutospacing="0"/>
+      </w:pPr>
+    </w:p>
+    <w:p>
+      <w:pPr>
+        <w:pStyle w:val="NormalWeb"/>
+        <w:numPr>
+          <w:ilvl w:val="0"/>
+          <w:numId w:val="12"/>
+        </w:numPr>
+        <w:spacing w:before="0" w:beforeAutospacing="0" w:after="0" w:afterAutospacing="0"/>
+      </w:pPr>
+      <w:r>
+        <w:t>How broad with the mating systems</w:t>
+      </w:r>
+      <w:r>
+        <w:t>?</w:t>
+      </w:r>
+    </w:p>
+    <w:p>
+      <w:pPr>
+        <w:pStyle w:val="NormalWeb"/>
+        <w:numPr>
+          <w:ilvl w:val="0"/>
+          <w:numId w:val="12"/>
+        </w:numPr>
+        <w:spacing w:before="0" w:beforeAutospacing="0" w:after="0" w:afterAutospacing="0"/>
+      </w:pPr>
+      <w:r>
+        <w:t>More specific audience!!</w:t>
+      </w:r>
+    </w:p>
+    <w:p>
+      <w:pPr>
+        <w:pStyle w:val="NormalWeb"/>
+        <w:spacing w:before="0" w:beforeAutospacing="0" w:after="0" w:afterAutospacing="0"/>
+      </w:pPr>
+    </w:p>
+    <w:p>
+      <w:pPr>
+        <w:pStyle w:val="NormalWeb"/>
+        <w:spacing w:before="0" w:beforeAutospacing="0" w:after="0" w:afterAutospacing="0"/>
+      </w:pPr>
+      <w:r>
+        <w:t>Just say something</w:t>
+      </w:r>
+      <w:r>
+        <w:t>- does it need to be justified</w:t>
+      </w:r>
+    </w:p>
+    <w:p>
+      <w:pPr>
+        <w:pStyle w:val="NormalWeb"/>
+        <w:spacing w:before="0" w:beforeAutospacing="0" w:after="0" w:afterAutospacing="0"/>
+        <w:ind w:firstLine="360"/>
+      </w:pPr>
+    </w:p>
+    <w:p>
+      <w:pPr>
+        <w:pStyle w:val="NormalWeb"/>
+        <w:spacing w:before="0" w:beforeAutospacing="0" w:after="0" w:afterAutospacing="0"/>
+        <w:ind w:firstLine="360"/>
+      </w:pPr>
     </w:p>
     <w:p>
       <w:pPr>
@@ -1063,72 +1646,6 @@
       </w:r>
       <w:r>
         <w:t>s:</w:t>
-      </w:r>
-    </w:p>
-    <w:p>
-      <w:pPr>
-        <w:pStyle w:val="NormalWeb"/>
-        <w:numPr>
-          <w:ilvl w:val="0"/>
-          <w:numId w:val="9"/>
-        </w:numPr>
-        <w:spacing w:before="0" w:beforeAutospacing="0" w:after="240" w:afterAutospacing="0"/>
-      </w:pPr>
-      <w:r>
-        <w:t>Is there selection on dimorphic floral traits in females and hermaphrodites</w:t>
-      </w:r>
-      <w:r>
-        <w:t>,</w:t>
-      </w:r>
-      <w:r>
-        <w:t xml:space="preserve"> driven by agents of selection?</w:t>
-      </w:r>
-    </w:p>
-    <w:p>
-      <w:pPr>
-        <w:pStyle w:val="NormalWeb"/>
-        <w:numPr>
-          <w:ilvl w:val="0"/>
-          <w:numId w:val="9"/>
-        </w:numPr>
-        <w:spacing w:before="0" w:beforeAutospacing="0" w:after="240" w:afterAutospacing="0"/>
-      </w:pPr>
-      <w:r>
-        <w:t xml:space="preserve">Do the </w:t>
-      </w:r>
-      <w:r>
-        <w:t xml:space="preserve">site-level and micro-level </w:t>
-      </w:r>
-      <w:r>
-        <w:t>sex ratio</w:t>
-      </w:r>
-      <w:r>
-        <w:t>s</w:t>
-      </w:r>
-      <w:r>
-        <w:t xml:space="preserve"> impact pollination and ultimately reproductive output?</w:t>
-      </w:r>
-    </w:p>
-    <w:p>
-      <w:pPr>
-        <w:pStyle w:val="NormalWeb"/>
-        <w:numPr>
-          <w:ilvl w:val="0"/>
-          <w:numId w:val="9"/>
-        </w:numPr>
-        <w:spacing w:before="0" w:beforeAutospacing="0" w:after="240" w:afterAutospacing="0"/>
-      </w:pPr>
-      <w:r>
-        <w:t>What are the</w:t>
-      </w:r>
-      <w:r>
-        <w:t xml:space="preserve"> implications </w:t>
-      </w:r>
-      <w:r>
-        <w:t>of</w:t>
-      </w:r>
-      <w:r>
-        <w:t xml:space="preserve"> patterns of selection for the evolutionary trajectory of this species?</w:t>
       </w:r>
     </w:p>
     <w:p>
@@ -4558,7 +5075,16 @@
         <w:t>47.846</w:t>
       </w:r>
       <w:r>
-        <w:t xml:space="preserve">, p&lt;0.001). </w:t>
+        <w:t>, p&lt;0.001)</w:t>
+      </w:r>
+      <w:r>
+        <w:t xml:space="preserve">. Flowers with longer stigmas were more likely to have </w:t>
+      </w:r>
+      <w:r>
+        <w:t>ovules</w:t>
+      </w:r>
+      <w:r>
+        <w:t xml:space="preserve">. </w:t>
       </w:r>
       <w:r>
         <w:t xml:space="preserve">Individuals varied </w:t>
@@ -4592,30 +5118,6 @@
       </w:r>
       <w:r>
         <w:t xml:space="preserve"> </w:t>
-      </w:r>
-      <w:r>
-        <w:t>The interaction</w:t>
-      </w:r>
-      <w:r>
-        <w:t xml:space="preserve"> between stigma length and sex was not </w:t>
-      </w:r>
-      <w:r>
-        <w:t>significant</w:t>
-      </w:r>
-      <w:r>
-        <w:t xml:space="preserve"> (χ</w:t>
-      </w:r>
-      <w:r>
-        <w:rPr>
-          <w:vertAlign w:val="superscript"/>
-        </w:rPr>
-        <w:t>2</w:t>
-      </w:r>
-      <w:r>
-        <w:t>=1.653, p=0.199)</w:t>
-      </w:r>
-      <w:r>
-        <w:t xml:space="preserve">. </w:t>
       </w:r>
       <w:r>
         <w:t>Some h</w:t>
@@ -4915,6 +5417,32 @@
         <w:pStyle w:val="NormalWeb"/>
         <w:spacing w:before="0" w:beforeAutospacing="0" w:after="0" w:afterAutospacing="0"/>
       </w:pPr>
+    </w:p>
+    <w:p>
+      <w:pPr>
+        <w:pStyle w:val="NormalWeb"/>
+        <w:spacing w:before="0" w:beforeAutospacing="0" w:after="0" w:afterAutospacing="0"/>
+        <w:rPr>
+          <w:i/>
+          <w:iCs/>
+        </w:rPr>
+      </w:pPr>
+      <w:r>
+        <w:rPr>
+          <w:i/>
+          <w:iCs/>
+        </w:rPr>
+        <w:t>Female function</w:t>
+      </w:r>
+    </w:p>
+    <w:p>
+      <w:pPr>
+        <w:pStyle w:val="NormalWeb"/>
+        <w:spacing w:before="0" w:beforeAutospacing="0" w:after="0" w:afterAutospacing="0"/>
+      </w:pPr>
+      <w:r>
+        <w:t>Site level sex ratio from the demography plots</w:t>
+      </w:r>
     </w:p>
     <w:p>
       <w:pPr>
@@ -7961,13 +8489,7 @@
         <w:t>9.73</w:t>
       </w:r>
       <w:r>
-        <w:t xml:space="preserve"> (</w:t>
-      </w:r>
-      <w:r>
-        <w:t>±</w:t>
-      </w:r>
-      <w:r>
-        <w:t xml:space="preserve">7.74) </w:t>
+        <w:t xml:space="preserve"> (±7.74) </w:t>
       </w:r>
       <w:r>
         <w:t xml:space="preserve">seeds, but the </w:t>
@@ -8067,10 +8589,10 @@
         </w:rPr>
         <w:lastRenderedPageBreak/>
         <w:drawing>
-          <wp:inline distT="0" distB="0" distL="0" distR="0" wp14:anchorId="4B2F0EDE" wp14:editId="72FC39DE">
-            <wp:extent cx="5264331" cy="5196840"/>
-            <wp:effectExtent l="0" t="0" r="0" b="3810"/>
-            <wp:docPr id="1" name="Picture 1"/>
+          <wp:inline distT="0" distB="0" distL="0" distR="0" wp14:anchorId="305A4626" wp14:editId="0538E177">
+            <wp:extent cx="4572009" cy="6858014"/>
+            <wp:effectExtent l="0" t="0" r="0" b="0"/>
+            <wp:docPr id="4" name="Picture 4"/>
             <wp:cNvGraphicFramePr>
               <a:graphicFrameLocks xmlns:a="http://schemas.openxmlformats.org/drawingml/2006/main" noChangeAspect="1"/>
             </wp:cNvGraphicFramePr>
@@ -8078,7 +8600,7 @@
               <a:graphicData uri="http://schemas.openxmlformats.org/drawingml/2006/picture">
                 <pic:pic xmlns:pic="http://schemas.openxmlformats.org/drawingml/2006/picture">
                   <pic:nvPicPr>
-                    <pic:cNvPr id="1" name="Picture 1"/>
+                    <pic:cNvPr id="4" name="Picture 4"/>
                     <pic:cNvPicPr/>
                   </pic:nvPicPr>
                   <pic:blipFill>
@@ -8096,7 +8618,7 @@
                   <pic:spPr>
                     <a:xfrm>
                       <a:off x="0" y="0"/>
-                      <a:ext cx="5265187" cy="5197685"/>
+                      <a:ext cx="4572009" cy="6858014"/>
                     </a:xfrm>
                     <a:prstGeom prst="rect">
                       <a:avLst/>
@@ -8126,6 +8648,24 @@
       <w:r>
         <w:t>fruit set, seed set, and germination rate.</w:t>
       </w:r>
+    </w:p>
+    <w:p>
+      <w:pPr>
+        <w:pStyle w:val="NormalWeb"/>
+        <w:spacing w:before="0" w:beforeAutospacing="0" w:after="0" w:afterAutospacing="0"/>
+      </w:pPr>
+    </w:p>
+    <w:p>
+      <w:pPr>
+        <w:pStyle w:val="NormalWeb"/>
+        <w:spacing w:before="0" w:beforeAutospacing="0" w:after="0" w:afterAutospacing="0"/>
+      </w:pPr>
+    </w:p>
+    <w:p>
+      <w:pPr>
+        <w:pStyle w:val="NormalWeb"/>
+        <w:spacing w:before="0" w:beforeAutospacing="0" w:after="0" w:afterAutospacing="0"/>
+      </w:pPr>
     </w:p>
     <w:p>
       <w:pPr>
@@ -9309,7 +9849,6 @@
           <w:b/>
           <w:bCs/>
         </w:rPr>
-        <w:lastRenderedPageBreak/>
         <w:t>Discussion</w:t>
       </w:r>
     </w:p>
@@ -9353,7 +9892,31 @@
         <w:t>Silene acaulis</w:t>
       </w:r>
       <w:r>
-        <w:t xml:space="preserve">. We found that </w:t>
+        <w:t xml:space="preserve">. </w:t>
+      </w:r>
+    </w:p>
+    <w:p>
+      <w:pPr>
+        <w:pStyle w:val="NormalWeb"/>
+        <w:spacing w:before="0" w:beforeAutospacing="0" w:after="0" w:afterAutospacing="0"/>
+      </w:pPr>
+    </w:p>
+    <w:p>
+      <w:pPr>
+        <w:pStyle w:val="NormalWeb"/>
+        <w:spacing w:before="0" w:beforeAutospacing="0" w:after="0" w:afterAutospacing="0"/>
+      </w:pPr>
+      <w:r>
+        <w:t xml:space="preserve">While theory suggests that sex ratio may influence the </w:t>
+      </w:r>
+    </w:p>
+    <w:p>
+      <w:pPr>
+        <w:pStyle w:val="NormalWeb"/>
+        <w:spacing w:before="0" w:beforeAutospacing="0" w:after="0" w:afterAutospacing="0"/>
+      </w:pPr>
+      <w:r>
+        <w:t xml:space="preserve">We found that </w:t>
       </w:r>
       <w:r>
         <w:t>morphological selective pressures differ for females and hermaphrodites</w:t>
@@ -9807,7 +10370,11 @@
         <w:t xml:space="preserve">Individuals with </w:t>
       </w:r>
       <w:r>
-        <w:t xml:space="preserve">ovules were more likely to have longer stigmas. This may relate </w:t>
+        <w:t xml:space="preserve">ovules were more likely to have longer stigmas. This may </w:t>
+      </w:r>
+      <w:r>
+        <w:lastRenderedPageBreak/>
+        <w:t xml:space="preserve">relate </w:t>
       </w:r>
       <w:r>
         <w:t>the</w:t>
@@ -10023,11 +10590,7 @@
         <w:t>“male” competition is theoretically higher</w:t>
       </w:r>
       <w:r>
-        <w:t xml:space="preserve">. Hermaphrodites that either produce and develop ovules for female function and those that do not. The link to stigma length also indicates a potential reduction in structures related to female </w:t>
-      </w:r>
-      <w:r>
-        <w:lastRenderedPageBreak/>
-        <w:t>function</w:t>
+        <w:t>. Hermaphrodites that either produce and develop ovules for female function and those that do not. The link to stigma length also indicates a potential reduction in structures related to female function</w:t>
       </w:r>
       <w:r>
         <w:t xml:space="preserve">. </w:t>
@@ -10766,7 +11329,11 @@
         <w:t>high hermaphrodite</w:t>
       </w:r>
       <w:r>
-        <w:t xml:space="preserve"> population, females were less pollen limited according to the pollination experiment. </w:t>
+        <w:t xml:space="preserve"> population, females were less pollen limited according to the pollination </w:t>
+      </w:r>
+      <w:r>
+        <w:lastRenderedPageBreak/>
+        <w:t xml:space="preserve">experiment. </w:t>
       </w:r>
       <w:r>
         <w:t>One explanation might be that micro sex ratio is more important than broad, population</w:t>
@@ -11316,6 +11883,7 @@
         <w:rPr>
           <w:u w:val="single"/>
         </w:rPr>
+        <w:lastRenderedPageBreak/>
         <w:t>Key Results</w:t>
       </w:r>
     </w:p>
@@ -11508,7 +12076,6 @@
         <w:spacing w:before="0" w:beforeAutospacing="0" w:after="0" w:afterAutospacing="0"/>
       </w:pPr>
       <w:r>
-        <w:lastRenderedPageBreak/>
         <w:t>The likelihood of producing ovules is higher in females than hermaphrodites</w:t>
       </w:r>
       <w:r>
@@ -11973,7 +12540,6 @@
         <w:ind w:left="720" w:hanging="720"/>
       </w:pPr>
       <w:r>
-        <w:lastRenderedPageBreak/>
         <w:t xml:space="preserve">Charlesworth, B., and Charlesworth, D. 1978. A Model for the Evolution of Dioecy and Gynodioecy. The American Naturalist </w:t>
       </w:r>
       <w:r>
@@ -12238,6 +12804,7 @@
         <w:ind w:left="720" w:hanging="720"/>
       </w:pPr>
       <w:r>
+        <w:lastRenderedPageBreak/>
         <w:t xml:space="preserve">Svoen, M.E., Muller, E., Brysting, A.K., Kalas, I.H., and Eidesen, P.B. 2019. Female advantage? Investigating female frequency and establishment performance in high-Arctic Silene acaulis [Report]. Botany </w:t>
       </w:r>
       <w:r>
@@ -12626,9 +13193,9 @@
     </w:lvl>
   </w:abstractNum>
   <w:abstractNum w:abstractNumId="1" w15:restartNumberingAfterBreak="0">
-    <w:nsid w:val="1439107A"/>
+    <w:nsid w:val="0FE7394D"/>
     <w:multiLevelType w:val="hybridMultilevel"/>
-    <w:tmpl w:val="74E28350"/>
+    <w:tmpl w:val="C8060092"/>
     <w:lvl w:ilvl="0" w:tplc="04090001">
       <w:start w:val="1"/>
       <w:numFmt w:val="bullet"/>
@@ -12739,9 +13306,9 @@
     </w:lvl>
   </w:abstractNum>
   <w:abstractNum w:abstractNumId="2" w15:restartNumberingAfterBreak="0">
-    <w:nsid w:val="1CED71BB"/>
+    <w:nsid w:val="1439107A"/>
     <w:multiLevelType w:val="hybridMultilevel"/>
-    <w:tmpl w:val="C9289E62"/>
+    <w:tmpl w:val="74E28350"/>
     <w:lvl w:ilvl="0" w:tplc="04090001">
       <w:start w:val="1"/>
       <w:numFmt w:val="bullet"/>
@@ -12852,6 +13419,119 @@
     </w:lvl>
   </w:abstractNum>
   <w:abstractNum w:abstractNumId="3" w15:restartNumberingAfterBreak="0">
+    <w:nsid w:val="1CED71BB"/>
+    <w:multiLevelType w:val="hybridMultilevel"/>
+    <w:tmpl w:val="C9289E62"/>
+    <w:lvl w:ilvl="0" w:tplc="04090001">
+      <w:start w:val="1"/>
+      <w:numFmt w:val="bullet"/>
+      <w:lvlText w:val=""/>
+      <w:lvlJc w:val="left"/>
+      <w:pPr>
+        <w:ind w:left="720" w:hanging="360"/>
+      </w:pPr>
+      <w:rPr>
+        <w:rFonts w:ascii="Symbol" w:hAnsi="Symbol" w:hint="default"/>
+      </w:rPr>
+    </w:lvl>
+    <w:lvl w:ilvl="1" w:tplc="04090003" w:tentative="1">
+      <w:start w:val="1"/>
+      <w:numFmt w:val="bullet"/>
+      <w:lvlText w:val="o"/>
+      <w:lvlJc w:val="left"/>
+      <w:pPr>
+        <w:ind w:left="1440" w:hanging="360"/>
+      </w:pPr>
+      <w:rPr>
+        <w:rFonts w:ascii="Courier New" w:hAnsi="Courier New" w:cs="Courier New" w:hint="default"/>
+      </w:rPr>
+    </w:lvl>
+    <w:lvl w:ilvl="2" w:tplc="04090005" w:tentative="1">
+      <w:start w:val="1"/>
+      <w:numFmt w:val="bullet"/>
+      <w:lvlText w:val=""/>
+      <w:lvlJc w:val="left"/>
+      <w:pPr>
+        <w:ind w:left="2160" w:hanging="360"/>
+      </w:pPr>
+      <w:rPr>
+        <w:rFonts w:ascii="Wingdings" w:hAnsi="Wingdings" w:hint="default"/>
+      </w:rPr>
+    </w:lvl>
+    <w:lvl w:ilvl="3" w:tplc="04090001" w:tentative="1">
+      <w:start w:val="1"/>
+      <w:numFmt w:val="bullet"/>
+      <w:lvlText w:val=""/>
+      <w:lvlJc w:val="left"/>
+      <w:pPr>
+        <w:ind w:left="2880" w:hanging="360"/>
+      </w:pPr>
+      <w:rPr>
+        <w:rFonts w:ascii="Symbol" w:hAnsi="Symbol" w:hint="default"/>
+      </w:rPr>
+    </w:lvl>
+    <w:lvl w:ilvl="4" w:tplc="04090003" w:tentative="1">
+      <w:start w:val="1"/>
+      <w:numFmt w:val="bullet"/>
+      <w:lvlText w:val="o"/>
+      <w:lvlJc w:val="left"/>
+      <w:pPr>
+        <w:ind w:left="3600" w:hanging="360"/>
+      </w:pPr>
+      <w:rPr>
+        <w:rFonts w:ascii="Courier New" w:hAnsi="Courier New" w:cs="Courier New" w:hint="default"/>
+      </w:rPr>
+    </w:lvl>
+    <w:lvl w:ilvl="5" w:tplc="04090005" w:tentative="1">
+      <w:start w:val="1"/>
+      <w:numFmt w:val="bullet"/>
+      <w:lvlText w:val=""/>
+      <w:lvlJc w:val="left"/>
+      <w:pPr>
+        <w:ind w:left="4320" w:hanging="360"/>
+      </w:pPr>
+      <w:rPr>
+        <w:rFonts w:ascii="Wingdings" w:hAnsi="Wingdings" w:hint="default"/>
+      </w:rPr>
+    </w:lvl>
+    <w:lvl w:ilvl="6" w:tplc="04090001" w:tentative="1">
+      <w:start w:val="1"/>
+      <w:numFmt w:val="bullet"/>
+      <w:lvlText w:val=""/>
+      <w:lvlJc w:val="left"/>
+      <w:pPr>
+        <w:ind w:left="5040" w:hanging="360"/>
+      </w:pPr>
+      <w:rPr>
+        <w:rFonts w:ascii="Symbol" w:hAnsi="Symbol" w:hint="default"/>
+      </w:rPr>
+    </w:lvl>
+    <w:lvl w:ilvl="7" w:tplc="04090003" w:tentative="1">
+      <w:start w:val="1"/>
+      <w:numFmt w:val="bullet"/>
+      <w:lvlText w:val="o"/>
+      <w:lvlJc w:val="left"/>
+      <w:pPr>
+        <w:ind w:left="5760" w:hanging="360"/>
+      </w:pPr>
+      <w:rPr>
+        <w:rFonts w:ascii="Courier New" w:hAnsi="Courier New" w:cs="Courier New" w:hint="default"/>
+      </w:rPr>
+    </w:lvl>
+    <w:lvl w:ilvl="8" w:tplc="04090005" w:tentative="1">
+      <w:start w:val="1"/>
+      <w:numFmt w:val="bullet"/>
+      <w:lvlText w:val=""/>
+      <w:lvlJc w:val="left"/>
+      <w:pPr>
+        <w:ind w:left="6480" w:hanging="360"/>
+      </w:pPr>
+      <w:rPr>
+        <w:rFonts w:ascii="Wingdings" w:hAnsi="Wingdings" w:hint="default"/>
+      </w:rPr>
+    </w:lvl>
+  </w:abstractNum>
+  <w:abstractNum w:abstractNumId="4" w15:restartNumberingAfterBreak="0">
     <w:nsid w:val="20D96AF8"/>
     <w:multiLevelType w:val="hybridMultilevel"/>
     <w:tmpl w:val="144E4EF2"/>
@@ -12941,7 +13621,7 @@
       </w:pPr>
     </w:lvl>
   </w:abstractNum>
-  <w:abstractNum w:abstractNumId="4" w15:restartNumberingAfterBreak="0">
+  <w:abstractNum w:abstractNumId="5" w15:restartNumberingAfterBreak="0">
     <w:nsid w:val="216F4AAC"/>
     <w:multiLevelType w:val="hybridMultilevel"/>
     <w:tmpl w:val="573AA40C"/>
@@ -13030,7 +13710,7 @@
       </w:pPr>
     </w:lvl>
   </w:abstractNum>
-  <w:abstractNum w:abstractNumId="5" w15:restartNumberingAfterBreak="0">
+  <w:abstractNum w:abstractNumId="6" w15:restartNumberingAfterBreak="0">
     <w:nsid w:val="326636F9"/>
     <w:multiLevelType w:val="hybridMultilevel"/>
     <w:tmpl w:val="4A806380"/>
@@ -13143,7 +13823,7 @@
       </w:rPr>
     </w:lvl>
   </w:abstractNum>
-  <w:abstractNum w:abstractNumId="6" w15:restartNumberingAfterBreak="0">
+  <w:abstractNum w:abstractNumId="7" w15:restartNumberingAfterBreak="0">
     <w:nsid w:val="42E51DC1"/>
     <w:multiLevelType w:val="hybridMultilevel"/>
     <w:tmpl w:val="144E4EF2"/>
@@ -13233,7 +13913,7 @@
       </w:pPr>
     </w:lvl>
   </w:abstractNum>
-  <w:abstractNum w:abstractNumId="7" w15:restartNumberingAfterBreak="0">
+  <w:abstractNum w:abstractNumId="8" w15:restartNumberingAfterBreak="0">
     <w:nsid w:val="4D1A3698"/>
     <w:multiLevelType w:val="hybridMultilevel"/>
     <w:tmpl w:val="485E9718"/>
@@ -13346,7 +14026,7 @@
       </w:rPr>
     </w:lvl>
   </w:abstractNum>
-  <w:abstractNum w:abstractNumId="8" w15:restartNumberingAfterBreak="0">
+  <w:abstractNum w:abstractNumId="9" w15:restartNumberingAfterBreak="0">
     <w:nsid w:val="5D8D2DC3"/>
     <w:multiLevelType w:val="hybridMultilevel"/>
     <w:tmpl w:val="B50ACC88"/>
@@ -13459,7 +14139,7 @@
       </w:rPr>
     </w:lvl>
   </w:abstractNum>
-  <w:abstractNum w:abstractNumId="9" w15:restartNumberingAfterBreak="0">
+  <w:abstractNum w:abstractNumId="10" w15:restartNumberingAfterBreak="0">
     <w:nsid w:val="5FAA41CD"/>
     <w:multiLevelType w:val="hybridMultilevel"/>
     <w:tmpl w:val="12F6DA18"/>
@@ -13572,10 +14252,10 @@
       </w:rPr>
     </w:lvl>
   </w:abstractNum>
-  <w:abstractNum w:abstractNumId="10" w15:restartNumberingAfterBreak="0">
-    <w:nsid w:val="75726EDF"/>
+  <w:abstractNum w:abstractNumId="11" w15:restartNumberingAfterBreak="0">
+    <w:nsid w:val="66E704EC"/>
     <w:multiLevelType w:val="hybridMultilevel"/>
-    <w:tmpl w:val="5FE6612A"/>
+    <w:tmpl w:val="2488D312"/>
     <w:lvl w:ilvl="0" w:tplc="04090001">
       <w:start w:val="1"/>
       <w:numFmt w:val="bullet"/>
@@ -13685,38 +14365,505 @@
       </w:rPr>
     </w:lvl>
   </w:abstractNum>
+  <w:abstractNum w:abstractNumId="12" w15:restartNumberingAfterBreak="0">
+    <w:nsid w:val="692C7EC6"/>
+    <w:multiLevelType w:val="hybridMultilevel"/>
+    <w:tmpl w:val="B91CDB0A"/>
+    <w:lvl w:ilvl="0" w:tplc="04090001">
+      <w:start w:val="1"/>
+      <w:numFmt w:val="bullet"/>
+      <w:lvlText w:val=""/>
+      <w:lvlJc w:val="left"/>
+      <w:pPr>
+        <w:ind w:left="720" w:hanging="360"/>
+      </w:pPr>
+      <w:rPr>
+        <w:rFonts w:ascii="Symbol" w:hAnsi="Symbol" w:hint="default"/>
+      </w:rPr>
+    </w:lvl>
+    <w:lvl w:ilvl="1" w:tplc="04090003">
+      <w:start w:val="1"/>
+      <w:numFmt w:val="bullet"/>
+      <w:lvlText w:val="o"/>
+      <w:lvlJc w:val="left"/>
+      <w:pPr>
+        <w:ind w:left="1440" w:hanging="360"/>
+      </w:pPr>
+      <w:rPr>
+        <w:rFonts w:ascii="Courier New" w:hAnsi="Courier New" w:cs="Courier New" w:hint="default"/>
+      </w:rPr>
+    </w:lvl>
+    <w:lvl w:ilvl="2" w:tplc="04090005" w:tentative="1">
+      <w:start w:val="1"/>
+      <w:numFmt w:val="bullet"/>
+      <w:lvlText w:val=""/>
+      <w:lvlJc w:val="left"/>
+      <w:pPr>
+        <w:ind w:left="2160" w:hanging="360"/>
+      </w:pPr>
+      <w:rPr>
+        <w:rFonts w:ascii="Wingdings" w:hAnsi="Wingdings" w:hint="default"/>
+      </w:rPr>
+    </w:lvl>
+    <w:lvl w:ilvl="3" w:tplc="04090001" w:tentative="1">
+      <w:start w:val="1"/>
+      <w:numFmt w:val="bullet"/>
+      <w:lvlText w:val=""/>
+      <w:lvlJc w:val="left"/>
+      <w:pPr>
+        <w:ind w:left="2880" w:hanging="360"/>
+      </w:pPr>
+      <w:rPr>
+        <w:rFonts w:ascii="Symbol" w:hAnsi="Symbol" w:hint="default"/>
+      </w:rPr>
+    </w:lvl>
+    <w:lvl w:ilvl="4" w:tplc="04090003" w:tentative="1">
+      <w:start w:val="1"/>
+      <w:numFmt w:val="bullet"/>
+      <w:lvlText w:val="o"/>
+      <w:lvlJc w:val="left"/>
+      <w:pPr>
+        <w:ind w:left="3600" w:hanging="360"/>
+      </w:pPr>
+      <w:rPr>
+        <w:rFonts w:ascii="Courier New" w:hAnsi="Courier New" w:cs="Courier New" w:hint="default"/>
+      </w:rPr>
+    </w:lvl>
+    <w:lvl w:ilvl="5" w:tplc="04090005" w:tentative="1">
+      <w:start w:val="1"/>
+      <w:numFmt w:val="bullet"/>
+      <w:lvlText w:val=""/>
+      <w:lvlJc w:val="left"/>
+      <w:pPr>
+        <w:ind w:left="4320" w:hanging="360"/>
+      </w:pPr>
+      <w:rPr>
+        <w:rFonts w:ascii="Wingdings" w:hAnsi="Wingdings" w:hint="default"/>
+      </w:rPr>
+    </w:lvl>
+    <w:lvl w:ilvl="6" w:tplc="04090001" w:tentative="1">
+      <w:start w:val="1"/>
+      <w:numFmt w:val="bullet"/>
+      <w:lvlText w:val=""/>
+      <w:lvlJc w:val="left"/>
+      <w:pPr>
+        <w:ind w:left="5040" w:hanging="360"/>
+      </w:pPr>
+      <w:rPr>
+        <w:rFonts w:ascii="Symbol" w:hAnsi="Symbol" w:hint="default"/>
+      </w:rPr>
+    </w:lvl>
+    <w:lvl w:ilvl="7" w:tplc="04090003" w:tentative="1">
+      <w:start w:val="1"/>
+      <w:numFmt w:val="bullet"/>
+      <w:lvlText w:val="o"/>
+      <w:lvlJc w:val="left"/>
+      <w:pPr>
+        <w:ind w:left="5760" w:hanging="360"/>
+      </w:pPr>
+      <w:rPr>
+        <w:rFonts w:ascii="Courier New" w:hAnsi="Courier New" w:cs="Courier New" w:hint="default"/>
+      </w:rPr>
+    </w:lvl>
+    <w:lvl w:ilvl="8" w:tplc="04090005" w:tentative="1">
+      <w:start w:val="1"/>
+      <w:numFmt w:val="bullet"/>
+      <w:lvlText w:val=""/>
+      <w:lvlJc w:val="left"/>
+      <w:pPr>
+        <w:ind w:left="6480" w:hanging="360"/>
+      </w:pPr>
+      <w:rPr>
+        <w:rFonts w:ascii="Wingdings" w:hAnsi="Wingdings" w:hint="default"/>
+      </w:rPr>
+    </w:lvl>
+  </w:abstractNum>
+  <w:abstractNum w:abstractNumId="13" w15:restartNumberingAfterBreak="0">
+    <w:nsid w:val="6B3B1178"/>
+    <w:multiLevelType w:val="hybridMultilevel"/>
+    <w:tmpl w:val="D2AA75B0"/>
+    <w:lvl w:ilvl="0" w:tplc="0409000F">
+      <w:start w:val="1"/>
+      <w:numFmt w:val="decimal"/>
+      <w:lvlText w:val="%1."/>
+      <w:lvlJc w:val="left"/>
+      <w:pPr>
+        <w:ind w:left="720" w:hanging="360"/>
+      </w:pPr>
+      <w:rPr>
+        <w:rFonts w:hint="default"/>
+      </w:rPr>
+    </w:lvl>
+    <w:lvl w:ilvl="1" w:tplc="04090003" w:tentative="1">
+      <w:start w:val="1"/>
+      <w:numFmt w:val="bullet"/>
+      <w:lvlText w:val="o"/>
+      <w:lvlJc w:val="left"/>
+      <w:pPr>
+        <w:ind w:left="1440" w:hanging="360"/>
+      </w:pPr>
+      <w:rPr>
+        <w:rFonts w:ascii="Courier New" w:hAnsi="Courier New" w:cs="Courier New" w:hint="default"/>
+      </w:rPr>
+    </w:lvl>
+    <w:lvl w:ilvl="2" w:tplc="04090005" w:tentative="1">
+      <w:start w:val="1"/>
+      <w:numFmt w:val="bullet"/>
+      <w:lvlText w:val=""/>
+      <w:lvlJc w:val="left"/>
+      <w:pPr>
+        <w:ind w:left="2160" w:hanging="360"/>
+      </w:pPr>
+      <w:rPr>
+        <w:rFonts w:ascii="Wingdings" w:hAnsi="Wingdings" w:hint="default"/>
+      </w:rPr>
+    </w:lvl>
+    <w:lvl w:ilvl="3" w:tplc="04090001" w:tentative="1">
+      <w:start w:val="1"/>
+      <w:numFmt w:val="bullet"/>
+      <w:lvlText w:val=""/>
+      <w:lvlJc w:val="left"/>
+      <w:pPr>
+        <w:ind w:left="2880" w:hanging="360"/>
+      </w:pPr>
+      <w:rPr>
+        <w:rFonts w:ascii="Symbol" w:hAnsi="Symbol" w:hint="default"/>
+      </w:rPr>
+    </w:lvl>
+    <w:lvl w:ilvl="4" w:tplc="04090003" w:tentative="1">
+      <w:start w:val="1"/>
+      <w:numFmt w:val="bullet"/>
+      <w:lvlText w:val="o"/>
+      <w:lvlJc w:val="left"/>
+      <w:pPr>
+        <w:ind w:left="3600" w:hanging="360"/>
+      </w:pPr>
+      <w:rPr>
+        <w:rFonts w:ascii="Courier New" w:hAnsi="Courier New" w:cs="Courier New" w:hint="default"/>
+      </w:rPr>
+    </w:lvl>
+    <w:lvl w:ilvl="5" w:tplc="04090005" w:tentative="1">
+      <w:start w:val="1"/>
+      <w:numFmt w:val="bullet"/>
+      <w:lvlText w:val=""/>
+      <w:lvlJc w:val="left"/>
+      <w:pPr>
+        <w:ind w:left="4320" w:hanging="360"/>
+      </w:pPr>
+      <w:rPr>
+        <w:rFonts w:ascii="Wingdings" w:hAnsi="Wingdings" w:hint="default"/>
+      </w:rPr>
+    </w:lvl>
+    <w:lvl w:ilvl="6" w:tplc="04090001" w:tentative="1">
+      <w:start w:val="1"/>
+      <w:numFmt w:val="bullet"/>
+      <w:lvlText w:val=""/>
+      <w:lvlJc w:val="left"/>
+      <w:pPr>
+        <w:ind w:left="5040" w:hanging="360"/>
+      </w:pPr>
+      <w:rPr>
+        <w:rFonts w:ascii="Symbol" w:hAnsi="Symbol" w:hint="default"/>
+      </w:rPr>
+    </w:lvl>
+    <w:lvl w:ilvl="7" w:tplc="04090003" w:tentative="1">
+      <w:start w:val="1"/>
+      <w:numFmt w:val="bullet"/>
+      <w:lvlText w:val="o"/>
+      <w:lvlJc w:val="left"/>
+      <w:pPr>
+        <w:ind w:left="5760" w:hanging="360"/>
+      </w:pPr>
+      <w:rPr>
+        <w:rFonts w:ascii="Courier New" w:hAnsi="Courier New" w:cs="Courier New" w:hint="default"/>
+      </w:rPr>
+    </w:lvl>
+    <w:lvl w:ilvl="8" w:tplc="04090005" w:tentative="1">
+      <w:start w:val="1"/>
+      <w:numFmt w:val="bullet"/>
+      <w:lvlText w:val=""/>
+      <w:lvlJc w:val="left"/>
+      <w:pPr>
+        <w:ind w:left="6480" w:hanging="360"/>
+      </w:pPr>
+      <w:rPr>
+        <w:rFonts w:ascii="Wingdings" w:hAnsi="Wingdings" w:hint="default"/>
+      </w:rPr>
+    </w:lvl>
+  </w:abstractNum>
+  <w:abstractNum w:abstractNumId="14" w15:restartNumberingAfterBreak="0">
+    <w:nsid w:val="75726EDF"/>
+    <w:multiLevelType w:val="hybridMultilevel"/>
+    <w:tmpl w:val="5FE6612A"/>
+    <w:lvl w:ilvl="0" w:tplc="04090001">
+      <w:start w:val="1"/>
+      <w:numFmt w:val="bullet"/>
+      <w:lvlText w:val=""/>
+      <w:lvlJc w:val="left"/>
+      <w:pPr>
+        <w:ind w:left="720" w:hanging="360"/>
+      </w:pPr>
+      <w:rPr>
+        <w:rFonts w:ascii="Symbol" w:hAnsi="Symbol" w:hint="default"/>
+      </w:rPr>
+    </w:lvl>
+    <w:lvl w:ilvl="1" w:tplc="04090003" w:tentative="1">
+      <w:start w:val="1"/>
+      <w:numFmt w:val="bullet"/>
+      <w:lvlText w:val="o"/>
+      <w:lvlJc w:val="left"/>
+      <w:pPr>
+        <w:ind w:left="1440" w:hanging="360"/>
+      </w:pPr>
+      <w:rPr>
+        <w:rFonts w:ascii="Courier New" w:hAnsi="Courier New" w:cs="Courier New" w:hint="default"/>
+      </w:rPr>
+    </w:lvl>
+    <w:lvl w:ilvl="2" w:tplc="04090005" w:tentative="1">
+      <w:start w:val="1"/>
+      <w:numFmt w:val="bullet"/>
+      <w:lvlText w:val=""/>
+      <w:lvlJc w:val="left"/>
+      <w:pPr>
+        <w:ind w:left="2160" w:hanging="360"/>
+      </w:pPr>
+      <w:rPr>
+        <w:rFonts w:ascii="Wingdings" w:hAnsi="Wingdings" w:hint="default"/>
+      </w:rPr>
+    </w:lvl>
+    <w:lvl w:ilvl="3" w:tplc="04090001" w:tentative="1">
+      <w:start w:val="1"/>
+      <w:numFmt w:val="bullet"/>
+      <w:lvlText w:val=""/>
+      <w:lvlJc w:val="left"/>
+      <w:pPr>
+        <w:ind w:left="2880" w:hanging="360"/>
+      </w:pPr>
+      <w:rPr>
+        <w:rFonts w:ascii="Symbol" w:hAnsi="Symbol" w:hint="default"/>
+      </w:rPr>
+    </w:lvl>
+    <w:lvl w:ilvl="4" w:tplc="04090003" w:tentative="1">
+      <w:start w:val="1"/>
+      <w:numFmt w:val="bullet"/>
+      <w:lvlText w:val="o"/>
+      <w:lvlJc w:val="left"/>
+      <w:pPr>
+        <w:ind w:left="3600" w:hanging="360"/>
+      </w:pPr>
+      <w:rPr>
+        <w:rFonts w:ascii="Courier New" w:hAnsi="Courier New" w:cs="Courier New" w:hint="default"/>
+      </w:rPr>
+    </w:lvl>
+    <w:lvl w:ilvl="5" w:tplc="04090005" w:tentative="1">
+      <w:start w:val="1"/>
+      <w:numFmt w:val="bullet"/>
+      <w:lvlText w:val=""/>
+      <w:lvlJc w:val="left"/>
+      <w:pPr>
+        <w:ind w:left="4320" w:hanging="360"/>
+      </w:pPr>
+      <w:rPr>
+        <w:rFonts w:ascii="Wingdings" w:hAnsi="Wingdings" w:hint="default"/>
+      </w:rPr>
+    </w:lvl>
+    <w:lvl w:ilvl="6" w:tplc="04090001" w:tentative="1">
+      <w:start w:val="1"/>
+      <w:numFmt w:val="bullet"/>
+      <w:lvlText w:val=""/>
+      <w:lvlJc w:val="left"/>
+      <w:pPr>
+        <w:ind w:left="5040" w:hanging="360"/>
+      </w:pPr>
+      <w:rPr>
+        <w:rFonts w:ascii="Symbol" w:hAnsi="Symbol" w:hint="default"/>
+      </w:rPr>
+    </w:lvl>
+    <w:lvl w:ilvl="7" w:tplc="04090003" w:tentative="1">
+      <w:start w:val="1"/>
+      <w:numFmt w:val="bullet"/>
+      <w:lvlText w:val="o"/>
+      <w:lvlJc w:val="left"/>
+      <w:pPr>
+        <w:ind w:left="5760" w:hanging="360"/>
+      </w:pPr>
+      <w:rPr>
+        <w:rFonts w:ascii="Courier New" w:hAnsi="Courier New" w:cs="Courier New" w:hint="default"/>
+      </w:rPr>
+    </w:lvl>
+    <w:lvl w:ilvl="8" w:tplc="04090005" w:tentative="1">
+      <w:start w:val="1"/>
+      <w:numFmt w:val="bullet"/>
+      <w:lvlText w:val=""/>
+      <w:lvlJc w:val="left"/>
+      <w:pPr>
+        <w:ind w:left="6480" w:hanging="360"/>
+      </w:pPr>
+      <w:rPr>
+        <w:rFonts w:ascii="Wingdings" w:hAnsi="Wingdings" w:hint="default"/>
+      </w:rPr>
+    </w:lvl>
+  </w:abstractNum>
+  <w:abstractNum w:abstractNumId="15" w15:restartNumberingAfterBreak="0">
+    <w:nsid w:val="79505660"/>
+    <w:multiLevelType w:val="hybridMultilevel"/>
+    <w:tmpl w:val="DA7A1578"/>
+    <w:lvl w:ilvl="0" w:tplc="04090001">
+      <w:start w:val="1"/>
+      <w:numFmt w:val="bullet"/>
+      <w:lvlText w:val=""/>
+      <w:lvlJc w:val="left"/>
+      <w:pPr>
+        <w:ind w:left="1080" w:hanging="360"/>
+      </w:pPr>
+      <w:rPr>
+        <w:rFonts w:ascii="Symbol" w:hAnsi="Symbol" w:hint="default"/>
+      </w:rPr>
+    </w:lvl>
+    <w:lvl w:ilvl="1" w:tplc="04090003" w:tentative="1">
+      <w:start w:val="1"/>
+      <w:numFmt w:val="bullet"/>
+      <w:lvlText w:val="o"/>
+      <w:lvlJc w:val="left"/>
+      <w:pPr>
+        <w:ind w:left="1800" w:hanging="360"/>
+      </w:pPr>
+      <w:rPr>
+        <w:rFonts w:ascii="Courier New" w:hAnsi="Courier New" w:cs="Courier New" w:hint="default"/>
+      </w:rPr>
+    </w:lvl>
+    <w:lvl w:ilvl="2" w:tplc="04090005" w:tentative="1">
+      <w:start w:val="1"/>
+      <w:numFmt w:val="bullet"/>
+      <w:lvlText w:val=""/>
+      <w:lvlJc w:val="left"/>
+      <w:pPr>
+        <w:ind w:left="2520" w:hanging="360"/>
+      </w:pPr>
+      <w:rPr>
+        <w:rFonts w:ascii="Wingdings" w:hAnsi="Wingdings" w:hint="default"/>
+      </w:rPr>
+    </w:lvl>
+    <w:lvl w:ilvl="3" w:tplc="04090001" w:tentative="1">
+      <w:start w:val="1"/>
+      <w:numFmt w:val="bullet"/>
+      <w:lvlText w:val=""/>
+      <w:lvlJc w:val="left"/>
+      <w:pPr>
+        <w:ind w:left="3240" w:hanging="360"/>
+      </w:pPr>
+      <w:rPr>
+        <w:rFonts w:ascii="Symbol" w:hAnsi="Symbol" w:hint="default"/>
+      </w:rPr>
+    </w:lvl>
+    <w:lvl w:ilvl="4" w:tplc="04090003" w:tentative="1">
+      <w:start w:val="1"/>
+      <w:numFmt w:val="bullet"/>
+      <w:lvlText w:val="o"/>
+      <w:lvlJc w:val="left"/>
+      <w:pPr>
+        <w:ind w:left="3960" w:hanging="360"/>
+      </w:pPr>
+      <w:rPr>
+        <w:rFonts w:ascii="Courier New" w:hAnsi="Courier New" w:cs="Courier New" w:hint="default"/>
+      </w:rPr>
+    </w:lvl>
+    <w:lvl w:ilvl="5" w:tplc="04090005" w:tentative="1">
+      <w:start w:val="1"/>
+      <w:numFmt w:val="bullet"/>
+      <w:lvlText w:val=""/>
+      <w:lvlJc w:val="left"/>
+      <w:pPr>
+        <w:ind w:left="4680" w:hanging="360"/>
+      </w:pPr>
+      <w:rPr>
+        <w:rFonts w:ascii="Wingdings" w:hAnsi="Wingdings" w:hint="default"/>
+      </w:rPr>
+    </w:lvl>
+    <w:lvl w:ilvl="6" w:tplc="04090001" w:tentative="1">
+      <w:start w:val="1"/>
+      <w:numFmt w:val="bullet"/>
+      <w:lvlText w:val=""/>
+      <w:lvlJc w:val="left"/>
+      <w:pPr>
+        <w:ind w:left="5400" w:hanging="360"/>
+      </w:pPr>
+      <w:rPr>
+        <w:rFonts w:ascii="Symbol" w:hAnsi="Symbol" w:hint="default"/>
+      </w:rPr>
+    </w:lvl>
+    <w:lvl w:ilvl="7" w:tplc="04090003" w:tentative="1">
+      <w:start w:val="1"/>
+      <w:numFmt w:val="bullet"/>
+      <w:lvlText w:val="o"/>
+      <w:lvlJc w:val="left"/>
+      <w:pPr>
+        <w:ind w:left="6120" w:hanging="360"/>
+      </w:pPr>
+      <w:rPr>
+        <w:rFonts w:ascii="Courier New" w:hAnsi="Courier New" w:cs="Courier New" w:hint="default"/>
+      </w:rPr>
+    </w:lvl>
+    <w:lvl w:ilvl="8" w:tplc="04090005" w:tentative="1">
+      <w:start w:val="1"/>
+      <w:numFmt w:val="bullet"/>
+      <w:lvlText w:val=""/>
+      <w:lvlJc w:val="left"/>
+      <w:pPr>
+        <w:ind w:left="6840" w:hanging="360"/>
+      </w:pPr>
+      <w:rPr>
+        <w:rFonts w:ascii="Wingdings" w:hAnsi="Wingdings" w:hint="default"/>
+      </w:rPr>
+    </w:lvl>
+  </w:abstractNum>
   <w:num w:numId="1">
+    <w:abstractNumId w:val="14"/>
+  </w:num>
+  <w:num w:numId="2">
+    <w:abstractNumId w:val="6"/>
+  </w:num>
+  <w:num w:numId="3">
     <w:abstractNumId w:val="10"/>
   </w:num>
-  <w:num w:numId="2">
-    <w:abstractNumId w:val="5"/>
+  <w:num w:numId="4">
+    <w:abstractNumId w:val="8"/>
   </w:num>
-  <w:num w:numId="3">
+  <w:num w:numId="5">
     <w:abstractNumId w:val="9"/>
   </w:num>
-  <w:num w:numId="4">
+  <w:num w:numId="6">
     <w:abstractNumId w:val="7"/>
   </w:num>
-  <w:num w:numId="5">
-    <w:abstractNumId w:val="8"/>
-  </w:num>
-  <w:num w:numId="6">
-    <w:abstractNumId w:val="6"/>
-  </w:num>
   <w:num w:numId="7">
-    <w:abstractNumId w:val="3"/>
+    <w:abstractNumId w:val="4"/>
   </w:num>
   <w:num w:numId="8">
-    <w:abstractNumId w:val="1"/>
+    <w:abstractNumId w:val="2"/>
   </w:num>
   <w:num w:numId="9">
     <w:abstractNumId w:val="0"/>
   </w:num>
   <w:num w:numId="10">
-    <w:abstractNumId w:val="2"/>
+    <w:abstractNumId w:val="3"/>
   </w:num>
   <w:num w:numId="11">
-    <w:abstractNumId w:val="4"/>
+    <w:abstractNumId w:val="5"/>
+  </w:num>
+  <w:num w:numId="12">
+    <w:abstractNumId w:val="15"/>
+  </w:num>
+  <w:num w:numId="13">
+    <w:abstractNumId w:val="11"/>
+  </w:num>
+  <w:num w:numId="14">
+    <w:abstractNumId w:val="12"/>
+  </w:num>
+  <w:num w:numId="15">
+    <w:abstractNumId w:val="1"/>
+  </w:num>
+  <w:num w:numId="16">
+    <w:abstractNumId w:val="13"/>
   </w:num>
 </w:numbering>
 </file>

</xml_diff>